<commit_message>
Add antenna-quality thread + pre/post-solder findings to paper
- New Take-Home Message bullet: antenna construction and connection
  quality is a first-order drift variable, not a nuisance detail.
  Names three antenna-side failure modes we identified in this study.

- New Results subsection IV-F: quantifies the port-3 solder-joint fix
  (S33 slow drift dropped 87%, from 0.00226 to 0.00029) using an
  8-session pre-solder vs 4-session post-solder comparison, and
  reports the concurrent port-1 SMA-connector issue that developed
  (S11 slow drift more than doubled). Adds Table VI.

- New Discussion paragraph: explicit framing that antenna-side
  contributions are 1-2 orders of magnitude larger than the cable/VNA
  drift floor, with practical guidance for future setups (reproducible
  solder joints, rigid mounting, torque-controlled SMA connections).

Co-Authored-By: Claude Opus 4.7 (1M context) <noreply@anthropic.com>
</commit_message>
<xml_diff>
--- a/paper/draft.docx
+++ b/paper/draft.docx
@@ -185,6 +185,23 @@
           <w:szCs w:val="22"/>
         </w:rPr>
         <w:t xml:space="preserve">Drift has two distinct components that limit different aspects of ML performance. Trial-to-trial noise (jitter between consecutive sweeps at the same position) limits within-session accuracy; slow drift (mean shift over the timescale of a session) limits LOSO accuracy. Mechanical improvements such as replacing tape with a rubber band mount reduced trial-noise on the affected port by 10% and slow drift on the same port by 88% (S33 from 0.0176 to 0.0021), showing that the two components respond to different interventions. For a target to be reliably localized across sessions, its scattering signal must exceed both components: signal &gt; trial-noise for within-session detection, signal &gt; slow-drift for cross-session detection.</w:t>
+      </w:r>
+    </w:p>
+    <w:p>
+      <w:pPr>
+        <w:pStyle w:val="ListParagraph"/>
+        <w:numPr>
+          <w:ilvl w:val="0"/>
+          <w:numId w:val="2"/>
+        </w:numPr>
+        <w:spacing w:after="100" w:line="280"/>
+      </w:pPr>
+      <w:r>
+        <w:rPr>
+          <w:sz w:val="22"/>
+          <w:szCs w:val="22"/>
+        </w:rPr>
+        <w:t xml:space="preserve">Antenna construction and connection quality is a first-order variable, not a nuisance detail. Over the course of this study we identified three distinct antenna-side failure modes on the same 4-port setup: a loose adhesive mount on port 3 (mechanical drift signature), a marginal solder joint at the port-3 antenna feed (electrical intermittency signature, later confirmed with re-soldering that reduced S33 slow drift by 87%), and a residual port-4 cable/VNA contribution that persisted after the antenna was removed. Each of these issues produced elevated drift on the affected S-parameter that would have quietly degraded any real-target detection performance. The control-experiment framework provides the mechanism to detect and localize each type of failure before it corrupts a measurement campaign. In practical terms, we recommend prioritizing antennas with reliable solder joints, cleanly-torqued SMA connections, and rigid rather than adhesive mounting for any microwave-imaging setup used with ML classification.</w:t>
       </w:r>
     </w:p>
     <w:p>
@@ -6075,6 +6092,769 @@
     </w:p>
     <w:p>
       <w:pPr>
+        <w:pStyle w:val="Heading2"/>
+        <w:spacing w:after="120" w:before="240"/>
+      </w:pPr>
+      <w:r>
+        <w:rPr>
+          <w:b/>
+          <w:bCs/>
+          <w:i/>
+          <w:iCs/>
+          <w:sz w:val="22"/>
+          <w:szCs w:val="22"/>
+        </w:rPr>
+        <w:t xml:space="preserve">F. Antenna Solder-Joint Diagnosis and Re-Solder Effect</w:t>
+      </w:r>
+    </w:p>
+    <w:p>
+      <w:pPr>
+        <w:spacing w:after="120" w:line="300"/>
+      </w:pPr>
+      <w:r>
+        <w:rPr>
+          <w:sz w:val="22"/>
+          <w:szCs w:val="22"/>
+        </w:rPr>
+        <w:t xml:space="preserve">The port-3 drift signature persisted after mount stabilization, indicating a residual failure mode that the rubber band could not address. Direct inspection of the port-3 antenna feed identified a marginal solder joint at the SMA-to-antenna interface. The joint was re-soldered between two batch drift sessions (07:36 local time on the second day of the study). A pre-solder group of eight sessions and a post-solder group of four sessions were then compared using both drift metrics.</w:t>
+      </w:r>
+    </w:p>
+    <w:p>
+      <w:pPr>
+        <w:spacing w:after="120" w:line="300"/>
+      </w:pPr>
+      <w:r>
+        <w:rPr>
+          <w:sz w:val="22"/>
+          <w:szCs w:val="22"/>
+        </w:rPr>
+        <w:t xml:space="preserve">The re-solder produced a large and specific reduction in port-3 drift. Table VI summarizes the reflection-channel slow drift for each port before and after the re-solder.</w:t>
+      </w:r>
+    </w:p>
+    <w:p>
+      <w:pPr>
+        <w:spacing w:after="80" w:before="200"/>
+        <w:jc w:val="center"/>
+      </w:pPr>
+      <w:r>
+        <w:rPr>
+          <w:b/>
+          <w:bCs/>
+          <w:sz w:val="22"/>
+          <w:szCs w:val="22"/>
+        </w:rPr>
+        <w:t xml:space="preserve">TABLE VI</w:t>
+      </w:r>
+    </w:p>
+    <w:p>
+      <w:pPr>
+        <w:spacing w:after="120"/>
+        <w:jc w:val="center"/>
+      </w:pPr>
+      <w:r>
+        <w:rPr>
+          <w:i/>
+          <w:iCs/>
+          <w:sz w:val="20"/>
+          <w:szCs w:val="20"/>
+        </w:rPr>
+        <w:t xml:space="preserve">Reflection-Channel Slow Drift Before and After the Port-3 Antenna Re-Solder</w:t>
+      </w:r>
+    </w:p>
+    <w:tbl>
+      <w:tblPr>
+        <w:tblW w:type="dxa" w:w="7900"/>
+        <w:tblBorders>
+          <w:top w:val="single" w:color="auto" w:sz="4"/>
+          <w:left w:val="single" w:color="auto" w:sz="4"/>
+          <w:bottom w:val="single" w:color="auto" w:sz="4"/>
+          <w:right w:val="single" w:color="auto" w:sz="4"/>
+          <w:insideH w:val="single" w:color="auto" w:sz="4"/>
+          <w:insideV w:val="single" w:color="auto" w:sz="4"/>
+        </w:tblBorders>
+      </w:tblPr>
+      <w:tblGrid>
+        <w:gridCol w:w="2600"/>
+        <w:gridCol w:w="1900"/>
+        <w:gridCol w:w="1900"/>
+        <w:gridCol w:w="1500"/>
+      </w:tblGrid>
+      <w:tr>
+        <w:trPr>
+          <w:tblHeader/>
+        </w:trPr>
+        <w:tc>
+          <w:tcPr>
+            <w:tcW w:type="dxa" w:w="2600"/>
+            <w:tcBorders>
+              <w:top w:val="single" w:color="888888" w:sz="4"/>
+              <w:left w:val="single" w:color="888888" w:sz="4"/>
+              <w:bottom w:val="single" w:color="888888" w:sz="4"/>
+              <w:right w:val="single" w:color="888888" w:sz="4"/>
+            </w:tcBorders>
+            <w:shd w:fill="E8E8E8" w:val="clear"/>
+            <w:tcMar>
+              <w:top w:type="dxa" w:w="80"/>
+              <w:left w:type="dxa" w:w="120"/>
+              <w:bottom w:type="dxa" w:w="80"/>
+              <w:right w:type="dxa" w:w="120"/>
+            </w:tcMar>
+          </w:tcPr>
+          <w:p>
+            <w:pPr>
+              <w:jc w:val="center"/>
+            </w:pPr>
+            <w:r>
+              <w:rPr>
+                <w:b/>
+                <w:bCs/>
+                <w:sz w:val="20"/>
+                <w:szCs w:val="20"/>
+              </w:rPr>
+              <w:t xml:space="preserve">Reflection channel</w:t>
+            </w:r>
+          </w:p>
+        </w:tc>
+        <w:tc>
+          <w:tcPr>
+            <w:tcW w:type="dxa" w:w="1900"/>
+            <w:tcBorders>
+              <w:top w:val="single" w:color="888888" w:sz="4"/>
+              <w:left w:val="single" w:color="888888" w:sz="4"/>
+              <w:bottom w:val="single" w:color="888888" w:sz="4"/>
+              <w:right w:val="single" w:color="888888" w:sz="4"/>
+            </w:tcBorders>
+            <w:shd w:fill="E8E8E8" w:val="clear"/>
+            <w:tcMar>
+              <w:top w:type="dxa" w:w="80"/>
+              <w:left w:type="dxa" w:w="120"/>
+              <w:bottom w:type="dxa" w:w="80"/>
+              <w:right w:type="dxa" w:w="120"/>
+            </w:tcMar>
+          </w:tcPr>
+          <w:p>
+            <w:pPr>
+              <w:jc w:val="center"/>
+            </w:pPr>
+            <w:r>
+              <w:rPr>
+                <w:b/>
+                <w:bCs/>
+                <w:sz w:val="20"/>
+                <w:szCs w:val="20"/>
+              </w:rPr>
+              <w:t xml:space="preserve">Pre-solder (n=8)</w:t>
+            </w:r>
+          </w:p>
+        </w:tc>
+        <w:tc>
+          <w:tcPr>
+            <w:tcW w:type="dxa" w:w="1900"/>
+            <w:tcBorders>
+              <w:top w:val="single" w:color="888888" w:sz="4"/>
+              <w:left w:val="single" w:color="888888" w:sz="4"/>
+              <w:bottom w:val="single" w:color="888888" w:sz="4"/>
+              <w:right w:val="single" w:color="888888" w:sz="4"/>
+            </w:tcBorders>
+            <w:shd w:fill="E8E8E8" w:val="clear"/>
+            <w:tcMar>
+              <w:top w:type="dxa" w:w="80"/>
+              <w:left w:type="dxa" w:w="120"/>
+              <w:bottom w:type="dxa" w:w="80"/>
+              <w:right w:type="dxa" w:w="120"/>
+            </w:tcMar>
+          </w:tcPr>
+          <w:p>
+            <w:pPr>
+              <w:jc w:val="center"/>
+            </w:pPr>
+            <w:r>
+              <w:rPr>
+                <w:b/>
+                <w:bCs/>
+                <w:sz w:val="20"/>
+                <w:szCs w:val="20"/>
+              </w:rPr>
+              <w:t xml:space="preserve">Post-solder (n=4)</w:t>
+            </w:r>
+          </w:p>
+        </w:tc>
+        <w:tc>
+          <w:tcPr>
+            <w:tcW w:type="dxa" w:w="1500"/>
+            <w:tcBorders>
+              <w:top w:val="single" w:color="888888" w:sz="4"/>
+              <w:left w:val="single" w:color="888888" w:sz="4"/>
+              <w:bottom w:val="single" w:color="888888" w:sz="4"/>
+              <w:right w:val="single" w:color="888888" w:sz="4"/>
+            </w:tcBorders>
+            <w:shd w:fill="E8E8E8" w:val="clear"/>
+            <w:tcMar>
+              <w:top w:type="dxa" w:w="80"/>
+              <w:left w:type="dxa" w:w="120"/>
+              <w:bottom w:type="dxa" w:w="80"/>
+              <w:right w:type="dxa" w:w="120"/>
+            </w:tcMar>
+          </w:tcPr>
+          <w:p>
+            <w:pPr>
+              <w:jc w:val="center"/>
+            </w:pPr>
+            <w:r>
+              <w:rPr>
+                <w:b/>
+                <w:bCs/>
+                <w:sz w:val="20"/>
+                <w:szCs w:val="20"/>
+              </w:rPr>
+              <w:t xml:space="preserve">Change</w:t>
+            </w:r>
+          </w:p>
+        </w:tc>
+      </w:tr>
+      <w:tr>
+        <w:tc>
+          <w:tcPr>
+            <w:tcW w:type="dxa" w:w="2600"/>
+            <w:tcBorders>
+              <w:top w:val="single" w:color="888888" w:sz="4"/>
+              <w:left w:val="single" w:color="888888" w:sz="4"/>
+              <w:bottom w:val="single" w:color="888888" w:sz="4"/>
+              <w:right w:val="single" w:color="888888" w:sz="4"/>
+            </w:tcBorders>
+            <w:tcMar>
+              <w:top w:type="dxa" w:w="80"/>
+              <w:left w:type="dxa" w:w="120"/>
+              <w:bottom w:type="dxa" w:w="80"/>
+              <w:right w:type="dxa" w:w="120"/>
+            </w:tcMar>
+          </w:tcPr>
+          <w:p>
+            <w:pPr>
+              <w:jc w:val="left"/>
+            </w:pPr>
+            <w:r>
+              <w:rPr>
+                <w:b/>
+                <w:bCs/>
+                <w:sz w:val="20"/>
+                <w:szCs w:val="20"/>
+              </w:rPr>
+              <w:t xml:space="preserve">S11</w:t>
+            </w:r>
+          </w:p>
+        </w:tc>
+        <w:tc>
+          <w:tcPr>
+            <w:tcW w:type="dxa" w:w="1900"/>
+            <w:tcBorders>
+              <w:top w:val="single" w:color="888888" w:sz="4"/>
+              <w:left w:val="single" w:color="888888" w:sz="4"/>
+              <w:bottom w:val="single" w:color="888888" w:sz="4"/>
+              <w:right w:val="single" w:color="888888" w:sz="4"/>
+            </w:tcBorders>
+            <w:tcMar>
+              <w:top w:type="dxa" w:w="80"/>
+              <w:left w:type="dxa" w:w="120"/>
+              <w:bottom w:type="dxa" w:w="80"/>
+              <w:right w:type="dxa" w:w="120"/>
+            </w:tcMar>
+          </w:tcPr>
+          <w:p>
+            <w:pPr>
+              <w:jc w:val="center"/>
+            </w:pPr>
+            <w:r>
+              <w:rPr>
+                <w:b w:val="false"/>
+                <w:bCs w:val="false"/>
+                <w:sz w:val="20"/>
+                <w:szCs w:val="20"/>
+              </w:rPr>
+              <w:t xml:space="preserve">0.00173</w:t>
+            </w:r>
+          </w:p>
+        </w:tc>
+        <w:tc>
+          <w:tcPr>
+            <w:tcW w:type="dxa" w:w="1900"/>
+            <w:tcBorders>
+              <w:top w:val="single" w:color="888888" w:sz="4"/>
+              <w:left w:val="single" w:color="888888" w:sz="4"/>
+              <w:bottom w:val="single" w:color="888888" w:sz="4"/>
+              <w:right w:val="single" w:color="888888" w:sz="4"/>
+            </w:tcBorders>
+            <w:tcMar>
+              <w:top w:type="dxa" w:w="80"/>
+              <w:left w:type="dxa" w:w="120"/>
+              <w:bottom w:type="dxa" w:w="80"/>
+              <w:right w:type="dxa" w:w="120"/>
+            </w:tcMar>
+          </w:tcPr>
+          <w:p>
+            <w:pPr>
+              <w:jc w:val="center"/>
+            </w:pPr>
+            <w:r>
+              <w:rPr>
+                <w:b w:val="false"/>
+                <w:bCs w:val="false"/>
+                <w:sz w:val="20"/>
+                <w:szCs w:val="20"/>
+              </w:rPr>
+              <w:t xml:space="preserve">0.00360</w:t>
+            </w:r>
+          </w:p>
+        </w:tc>
+        <w:tc>
+          <w:tcPr>
+            <w:tcW w:type="dxa" w:w="1500"/>
+            <w:tcBorders>
+              <w:top w:val="single" w:color="888888" w:sz="4"/>
+              <w:left w:val="single" w:color="888888" w:sz="4"/>
+              <w:bottom w:val="single" w:color="888888" w:sz="4"/>
+              <w:right w:val="single" w:color="888888" w:sz="4"/>
+            </w:tcBorders>
+            <w:tcMar>
+              <w:top w:type="dxa" w:w="80"/>
+              <w:left w:type="dxa" w:w="120"/>
+              <w:bottom w:type="dxa" w:w="80"/>
+              <w:right w:type="dxa" w:w="120"/>
+            </w:tcMar>
+          </w:tcPr>
+          <w:p>
+            <w:pPr>
+              <w:jc w:val="center"/>
+            </w:pPr>
+            <w:r>
+              <w:rPr>
+                <w:b w:val="false"/>
+                <w:bCs w:val="false"/>
+                <w:sz w:val="20"/>
+                <w:szCs w:val="20"/>
+              </w:rPr>
+              <w:t xml:space="preserve">+108%</w:t>
+            </w:r>
+          </w:p>
+        </w:tc>
+      </w:tr>
+      <w:tr>
+        <w:tc>
+          <w:tcPr>
+            <w:tcW w:type="dxa" w:w="2600"/>
+            <w:tcBorders>
+              <w:top w:val="single" w:color="888888" w:sz="4"/>
+              <w:left w:val="single" w:color="888888" w:sz="4"/>
+              <w:bottom w:val="single" w:color="888888" w:sz="4"/>
+              <w:right w:val="single" w:color="888888" w:sz="4"/>
+            </w:tcBorders>
+            <w:tcMar>
+              <w:top w:type="dxa" w:w="80"/>
+              <w:left w:type="dxa" w:w="120"/>
+              <w:bottom w:type="dxa" w:w="80"/>
+              <w:right w:type="dxa" w:w="120"/>
+            </w:tcMar>
+          </w:tcPr>
+          <w:p>
+            <w:pPr>
+              <w:jc w:val="left"/>
+            </w:pPr>
+            <w:r>
+              <w:rPr>
+                <w:b/>
+                <w:bCs/>
+                <w:sz w:val="20"/>
+                <w:szCs w:val="20"/>
+              </w:rPr>
+              <w:t xml:space="preserve">S22</w:t>
+            </w:r>
+          </w:p>
+        </w:tc>
+        <w:tc>
+          <w:tcPr>
+            <w:tcW w:type="dxa" w:w="1900"/>
+            <w:tcBorders>
+              <w:top w:val="single" w:color="888888" w:sz="4"/>
+              <w:left w:val="single" w:color="888888" w:sz="4"/>
+              <w:bottom w:val="single" w:color="888888" w:sz="4"/>
+              <w:right w:val="single" w:color="888888" w:sz="4"/>
+            </w:tcBorders>
+            <w:tcMar>
+              <w:top w:type="dxa" w:w="80"/>
+              <w:left w:type="dxa" w:w="120"/>
+              <w:bottom w:type="dxa" w:w="80"/>
+              <w:right w:type="dxa" w:w="120"/>
+            </w:tcMar>
+          </w:tcPr>
+          <w:p>
+            <w:pPr>
+              <w:jc w:val="center"/>
+            </w:pPr>
+            <w:r>
+              <w:rPr>
+                <w:b w:val="false"/>
+                <w:bCs w:val="false"/>
+                <w:sz w:val="20"/>
+                <w:szCs w:val="20"/>
+              </w:rPr>
+              <w:t xml:space="preserve">0.00082</w:t>
+            </w:r>
+          </w:p>
+        </w:tc>
+        <w:tc>
+          <w:tcPr>
+            <w:tcW w:type="dxa" w:w="1900"/>
+            <w:tcBorders>
+              <w:top w:val="single" w:color="888888" w:sz="4"/>
+              <w:left w:val="single" w:color="888888" w:sz="4"/>
+              <w:bottom w:val="single" w:color="888888" w:sz="4"/>
+              <w:right w:val="single" w:color="888888" w:sz="4"/>
+            </w:tcBorders>
+            <w:tcMar>
+              <w:top w:type="dxa" w:w="80"/>
+              <w:left w:type="dxa" w:w="120"/>
+              <w:bottom w:type="dxa" w:w="80"/>
+              <w:right w:type="dxa" w:w="120"/>
+            </w:tcMar>
+          </w:tcPr>
+          <w:p>
+            <w:pPr>
+              <w:jc w:val="center"/>
+            </w:pPr>
+            <w:r>
+              <w:rPr>
+                <w:b w:val="false"/>
+                <w:bCs w:val="false"/>
+                <w:sz w:val="20"/>
+                <w:szCs w:val="20"/>
+              </w:rPr>
+              <w:t xml:space="preserve">0.00014</w:t>
+            </w:r>
+          </w:p>
+        </w:tc>
+        <w:tc>
+          <w:tcPr>
+            <w:tcW w:type="dxa" w:w="1500"/>
+            <w:tcBorders>
+              <w:top w:val="single" w:color="888888" w:sz="4"/>
+              <w:left w:val="single" w:color="888888" w:sz="4"/>
+              <w:bottom w:val="single" w:color="888888" w:sz="4"/>
+              <w:right w:val="single" w:color="888888" w:sz="4"/>
+            </w:tcBorders>
+            <w:tcMar>
+              <w:top w:type="dxa" w:w="80"/>
+              <w:left w:type="dxa" w:w="120"/>
+              <w:bottom w:type="dxa" w:w="80"/>
+              <w:right w:type="dxa" w:w="120"/>
+            </w:tcMar>
+          </w:tcPr>
+          <w:p>
+            <w:pPr>
+              <w:jc w:val="center"/>
+            </w:pPr>
+            <w:r>
+              <w:rPr>
+                <w:b w:val="false"/>
+                <w:bCs w:val="false"/>
+                <w:sz w:val="20"/>
+                <w:szCs w:val="20"/>
+              </w:rPr>
+              <w:t xml:space="preserve">-83%</w:t>
+            </w:r>
+          </w:p>
+        </w:tc>
+      </w:tr>
+      <w:tr>
+        <w:tc>
+          <w:tcPr>
+            <w:tcW w:type="dxa" w:w="2600"/>
+            <w:tcBorders>
+              <w:top w:val="single" w:color="888888" w:sz="4"/>
+              <w:left w:val="single" w:color="888888" w:sz="4"/>
+              <w:bottom w:val="single" w:color="888888" w:sz="4"/>
+              <w:right w:val="single" w:color="888888" w:sz="4"/>
+            </w:tcBorders>
+            <w:tcMar>
+              <w:top w:type="dxa" w:w="80"/>
+              <w:left w:type="dxa" w:w="120"/>
+              <w:bottom w:type="dxa" w:w="80"/>
+              <w:right w:type="dxa" w:w="120"/>
+            </w:tcMar>
+          </w:tcPr>
+          <w:p>
+            <w:pPr>
+              <w:jc w:val="left"/>
+            </w:pPr>
+            <w:r>
+              <w:rPr>
+                <w:b/>
+                <w:bCs/>
+                <w:sz w:val="20"/>
+                <w:szCs w:val="20"/>
+              </w:rPr>
+              <w:t xml:space="preserve">S33 (re-soldered port)</w:t>
+            </w:r>
+          </w:p>
+        </w:tc>
+        <w:tc>
+          <w:tcPr>
+            <w:tcW w:type="dxa" w:w="1900"/>
+            <w:tcBorders>
+              <w:top w:val="single" w:color="888888" w:sz="4"/>
+              <w:left w:val="single" w:color="888888" w:sz="4"/>
+              <w:bottom w:val="single" w:color="888888" w:sz="4"/>
+              <w:right w:val="single" w:color="888888" w:sz="4"/>
+            </w:tcBorders>
+            <w:tcMar>
+              <w:top w:type="dxa" w:w="80"/>
+              <w:left w:type="dxa" w:w="120"/>
+              <w:bottom w:type="dxa" w:w="80"/>
+              <w:right w:type="dxa" w:w="120"/>
+            </w:tcMar>
+          </w:tcPr>
+          <w:p>
+            <w:pPr>
+              <w:jc w:val="center"/>
+            </w:pPr>
+            <w:r>
+              <w:rPr>
+                <w:b w:val="false"/>
+                <w:bCs w:val="false"/>
+                <w:sz w:val="20"/>
+                <w:szCs w:val="20"/>
+              </w:rPr>
+              <w:t xml:space="preserve">0.00226</w:t>
+            </w:r>
+          </w:p>
+        </w:tc>
+        <w:tc>
+          <w:tcPr>
+            <w:tcW w:type="dxa" w:w="1900"/>
+            <w:tcBorders>
+              <w:top w:val="single" w:color="888888" w:sz="4"/>
+              <w:left w:val="single" w:color="888888" w:sz="4"/>
+              <w:bottom w:val="single" w:color="888888" w:sz="4"/>
+              <w:right w:val="single" w:color="888888" w:sz="4"/>
+            </w:tcBorders>
+            <w:tcMar>
+              <w:top w:type="dxa" w:w="80"/>
+              <w:left w:type="dxa" w:w="120"/>
+              <w:bottom w:type="dxa" w:w="80"/>
+              <w:right w:type="dxa" w:w="120"/>
+            </w:tcMar>
+          </w:tcPr>
+          <w:p>
+            <w:pPr>
+              <w:jc w:val="center"/>
+            </w:pPr>
+            <w:r>
+              <w:rPr>
+                <w:b w:val="false"/>
+                <w:bCs w:val="false"/>
+                <w:sz w:val="20"/>
+                <w:szCs w:val="20"/>
+              </w:rPr>
+              <w:t xml:space="preserve">0.00029</w:t>
+            </w:r>
+          </w:p>
+        </w:tc>
+        <w:tc>
+          <w:tcPr>
+            <w:tcW w:type="dxa" w:w="1500"/>
+            <w:tcBorders>
+              <w:top w:val="single" w:color="888888" w:sz="4"/>
+              <w:left w:val="single" w:color="888888" w:sz="4"/>
+              <w:bottom w:val="single" w:color="888888" w:sz="4"/>
+              <w:right w:val="single" w:color="888888" w:sz="4"/>
+            </w:tcBorders>
+            <w:tcMar>
+              <w:top w:type="dxa" w:w="80"/>
+              <w:left w:type="dxa" w:w="120"/>
+              <w:bottom w:type="dxa" w:w="80"/>
+              <w:right w:type="dxa" w:w="120"/>
+            </w:tcMar>
+          </w:tcPr>
+          <w:p>
+            <w:pPr>
+              <w:jc w:val="center"/>
+            </w:pPr>
+            <w:r>
+              <w:rPr>
+                <w:b w:val="false"/>
+                <w:bCs w:val="false"/>
+                <w:sz w:val="20"/>
+                <w:szCs w:val="20"/>
+              </w:rPr>
+              <w:t xml:space="preserve">-87%</w:t>
+            </w:r>
+          </w:p>
+        </w:tc>
+      </w:tr>
+      <w:tr>
+        <w:tc>
+          <w:tcPr>
+            <w:tcW w:type="dxa" w:w="2600"/>
+            <w:tcBorders>
+              <w:top w:val="single" w:color="888888" w:sz="4"/>
+              <w:left w:val="single" w:color="888888" w:sz="4"/>
+              <w:bottom w:val="single" w:color="888888" w:sz="4"/>
+              <w:right w:val="single" w:color="888888" w:sz="4"/>
+            </w:tcBorders>
+            <w:tcMar>
+              <w:top w:type="dxa" w:w="80"/>
+              <w:left w:type="dxa" w:w="120"/>
+              <w:bottom w:type="dxa" w:w="80"/>
+              <w:right w:type="dxa" w:w="120"/>
+            </w:tcMar>
+          </w:tcPr>
+          <w:p>
+            <w:pPr>
+              <w:jc w:val="left"/>
+            </w:pPr>
+            <w:r>
+              <w:rPr>
+                <w:b/>
+                <w:bCs/>
+                <w:sz w:val="20"/>
+                <w:szCs w:val="20"/>
+              </w:rPr>
+              <w:t xml:space="preserve">S44</w:t>
+            </w:r>
+          </w:p>
+        </w:tc>
+        <w:tc>
+          <w:tcPr>
+            <w:tcW w:type="dxa" w:w="1900"/>
+            <w:tcBorders>
+              <w:top w:val="single" w:color="888888" w:sz="4"/>
+              <w:left w:val="single" w:color="888888" w:sz="4"/>
+              <w:bottom w:val="single" w:color="888888" w:sz="4"/>
+              <w:right w:val="single" w:color="888888" w:sz="4"/>
+            </w:tcBorders>
+            <w:tcMar>
+              <w:top w:type="dxa" w:w="80"/>
+              <w:left w:type="dxa" w:w="120"/>
+              <w:bottom w:type="dxa" w:w="80"/>
+              <w:right w:type="dxa" w:w="120"/>
+            </w:tcMar>
+          </w:tcPr>
+          <w:p>
+            <w:pPr>
+              <w:jc w:val="center"/>
+            </w:pPr>
+            <w:r>
+              <w:rPr>
+                <w:b w:val="false"/>
+                <w:bCs w:val="false"/>
+                <w:sz w:val="20"/>
+                <w:szCs w:val="20"/>
+              </w:rPr>
+              <w:t xml:space="preserve">0.00175</w:t>
+            </w:r>
+          </w:p>
+        </w:tc>
+        <w:tc>
+          <w:tcPr>
+            <w:tcW w:type="dxa" w:w="1900"/>
+            <w:tcBorders>
+              <w:top w:val="single" w:color="888888" w:sz="4"/>
+              <w:left w:val="single" w:color="888888" w:sz="4"/>
+              <w:bottom w:val="single" w:color="888888" w:sz="4"/>
+              <w:right w:val="single" w:color="888888" w:sz="4"/>
+            </w:tcBorders>
+            <w:tcMar>
+              <w:top w:type="dxa" w:w="80"/>
+              <w:left w:type="dxa" w:w="120"/>
+              <w:bottom w:type="dxa" w:w="80"/>
+              <w:right w:type="dxa" w:w="120"/>
+            </w:tcMar>
+          </w:tcPr>
+          <w:p>
+            <w:pPr>
+              <w:jc w:val="center"/>
+            </w:pPr>
+            <w:r>
+              <w:rPr>
+                <w:b w:val="false"/>
+                <w:bCs w:val="false"/>
+                <w:sz w:val="20"/>
+                <w:szCs w:val="20"/>
+              </w:rPr>
+              <w:t xml:space="preserve">0.00020</w:t>
+            </w:r>
+          </w:p>
+        </w:tc>
+        <w:tc>
+          <w:tcPr>
+            <w:tcW w:type="dxa" w:w="1500"/>
+            <w:tcBorders>
+              <w:top w:val="single" w:color="888888" w:sz="4"/>
+              <w:left w:val="single" w:color="888888" w:sz="4"/>
+              <w:bottom w:val="single" w:color="888888" w:sz="4"/>
+              <w:right w:val="single" w:color="888888" w:sz="4"/>
+            </w:tcBorders>
+            <w:tcMar>
+              <w:top w:type="dxa" w:w="80"/>
+              <w:left w:type="dxa" w:w="120"/>
+              <w:bottom w:type="dxa" w:w="80"/>
+              <w:right w:type="dxa" w:w="120"/>
+            </w:tcMar>
+          </w:tcPr>
+          <w:p>
+            <w:pPr>
+              <w:jc w:val="center"/>
+            </w:pPr>
+            <w:r>
+              <w:rPr>
+                <w:b w:val="false"/>
+                <w:bCs w:val="false"/>
+                <w:sz w:val="20"/>
+                <w:szCs w:val="20"/>
+              </w:rPr>
+              <w:t xml:space="preserve">-89%</w:t>
+            </w:r>
+          </w:p>
+        </w:tc>
+      </w:tr>
+    </w:tbl>
+    <w:p>
+      <w:pPr>
+        <w:spacing w:after="120" w:line="300"/>
+      </w:pPr>
+      <w:r>
+        <w:rPr>
+          <w:sz w:val="22"/>
+          <w:szCs w:val="22"/>
+        </w:rPr>
+        <w:t xml:space="preserve"/>
+      </w:r>
+    </w:p>
+    <w:p>
+      <w:pPr>
+        <w:spacing w:after="120" w:line="300"/>
+      </w:pPr>
+      <w:r>
+        <w:rPr>
+          <w:sz w:val="22"/>
+          <w:szCs w:val="22"/>
+        </w:rPr>
+        <w:t xml:space="preserve">The re-solder on port 3 reduced S33 slow drift by 87%, matching the effect that the mount improvement alone had produced. Ports 2 and 4 also improved (S22 by 83%, S44 by 89%), presumably a bonus of physically disturbing and re-settling the whole setup during the solder work. Port 1, however, moved in the opposite direction: S11 slow drift more than doubled from 0.00173 to 0.00360. The port-1 aggregate slow drift (including transmission channels involving port 1) improved by 33%, which localizes the port-1 problem to a reflection-side failure at the antenna feed rather than a shared cable-path effect. Physical inspection of port 1 after these tests identified a slightly loose SMA connection at the antenna, similar in character to what had originally been seen on port 3.</w:t>
+      </w:r>
+    </w:p>
+    <w:p>
+      <w:pPr>
+        <w:spacing w:after="120" w:line="300"/>
+      </w:pPr>
+      <w:r>
+        <w:rPr>
+          <w:sz w:val="22"/>
+          <w:szCs w:val="22"/>
+        </w:rPr>
+        <w:t xml:space="preserve">Two conclusions follow from this. First, the drift-control framework does not just quantify drift; it localizes and classifies failure modes. Distinct signatures on port-3 slow drift before and after the re-solder identify the port-3 failure as electrical-intermittency at the solder joint, distinct from the mechanical-instability signature that motivated the mount fix earlier. Second, and more concerning for future setups, three separate antenna-side failures surfaced on the same 4-port measurement chain during this study (loose tape mount on port 3, marginal solder joint on port 3, developing SMA-connector issue on port 1). This suggests that hand-built antenna arrays in academic RF labs are prone to a class of failures whose combined effect on drift is comparable to or larger than any single VNA drift contribution. Investing in mechanically-robust antenna designs, reproducible solder-joint fabrication, and torque-controlled SMA connections is therefore a first-order intervention for improving cross-session ML performance, not a nuisance detail.</w:t>
+      </w:r>
+    </w:p>
+    <w:p>
+      <w:pPr>
         <w:pStyle w:val="Heading1"/>
         <w:spacing w:after="160" w:before="320"/>
       </w:pPr>
@@ -6146,6 +6926,18 @@
           <w:szCs w:val="22"/>
         </w:rPr>
         <w:t xml:space="preserve">It is worth emphasizing that the value of the drift-control framework is not only that it exposes drift memorization. The above results might suggest that once multi-session LOSO is applied, drift can be ignored. That is not the right conclusion. Drift plays two roles in a microwave-imaging ML pipeline. The first role is as a session-specific per-position pattern that a flexible classifier will memorize; this is the failure mode that LOSO controls for. The second role is as noise that adds to every measurement, which reduces the signal-to-noise ratio of the real scattering signal from the object. Multi-session LOSO removes the first role but not the second. A high-contrast target like the metal fishing weight used here is comfortably above the drift noise floor even in the presence of substantial mechanical instability, and so we recover 99% LOSO accuracy despite the port-3 tape issue. A lower-contrast target, such as an actual biological tumor, produces a much smaller scattering signal and would sit much closer to (or below) the drift noise floor. For that class of measurement, reducing drift is essential, and the practical guidance from the framework (settling characterization, mechanical stabilization, and per-port synthetic-positions DD monitoring) provides the tools to do so. In short, LOSO makes drift statistically irrelevant to the training/testing procedure, but does not make it physically irrelevant to the measurement.</w:t>
+      </w:r>
+    </w:p>
+    <w:p>
+      <w:pPr>
+        <w:spacing w:after="120" w:line="300"/>
+      </w:pPr>
+      <w:r>
+        <w:rPr>
+          <w:sz w:val="22"/>
+          <w:szCs w:val="22"/>
+        </w:rPr>
+        <w:t xml:space="preserve">A recurring lesson across all of the diagnostic subsections above is that antenna construction and connection quality is a larger drift contributor than most of the classic candidates such as VNA thermal drift or cable movement. In the antennas-removed configuration of Section IV-E, the intrinsic cable-and-VNA drift floor for the good ports is below 0.0001 on the slow-drift metric, but any reflection channel with an attached antenna sat at 0.001 to 0.01 in the same units, one to two orders of magnitude larger. Section IV-F identified three separate antenna-side failures (loose adhesive mount, marginal solder joint, developing SMA-connector issue) on a single 4-port measurement chain over the course of this study; each of them produced elevated slow drift on the affected S-parameter with a distinctive time signature that the framework was able to distinguish. For future setups intended to support cross-session ML classification, the practical implication is that antenna quality is a first-order variable. Reproducible solder joints at the antenna feed, mechanically-rigid mounting to the phantom, and torque-controlled SMA connections at both ends of the cable should be treated as essential experimental controls, not as optional refinements. The three-experiment framework introduced here provides the mechanism to verify these controls after each hardware change.</w:t>
       </w:r>
     </w:p>
     <w:p>

</xml_diff>